<commit_message>
refresh Higher Algebra 2.pdf
</commit_message>
<xml_diff>
--- a/tex/git_cv/NicholasHayekQuantCV.docx
+++ b/tex/git_cv/NicholasHayekQuantCV.docx
@@ -503,52 +503,39 @@
           <w:sz w:val="19"/>
           <w:szCs w:val="19"/>
         </w:rPr>
-        <w:t>Thesis: “</w:t>
-      </w:r>
-      <w:proofErr w:type="spellStart"/>
+        <w:t>Awards</w:t>
+      </w:r>
       <w:r>
         <w:rPr>
           <w:rFonts w:ascii="Garamond" w:hAnsi="Garamond" w:cs="Times New Roman"/>
           <w:sz w:val="19"/>
           <w:szCs w:val="19"/>
         </w:rPr>
-        <w:t>Supersingular</w:t>
-      </w:r>
-      <w:proofErr w:type="spellEnd"/>
+        <w:t>: D. Lorne Gales Scholarship</w:t>
+      </w:r>
       <w:r>
         <w:rPr>
           <w:rFonts w:ascii="Garamond" w:hAnsi="Garamond" w:cs="Times New Roman"/>
           <w:sz w:val="19"/>
           <w:szCs w:val="19"/>
         </w:rPr>
-        <w:t xml:space="preserve"> Elliptic Curves,” supervised by Prof. Henri Darmon.</w:t>
-      </w:r>
-    </w:p>
-    <w:p>
-      <w:pPr>
-        <w:pStyle w:val="ListParagraph"/>
-        <w:numPr>
-          <w:ilvl w:val="0"/>
-          <w:numId w:val="1"/>
-        </w:numPr>
-        <w:tabs>
-          <w:tab w:val="right" w:pos="9360"/>
-        </w:tabs>
-        <w:spacing w:line="276" w:lineRule="auto"/>
-        <w:ind w:hanging="180"/>
+        <w:t xml:space="preserve">, </w:t>
+      </w:r>
+      <w:r>
         <w:rPr>
           <w:rFonts w:ascii="Garamond" w:hAnsi="Garamond" w:cs="Times New Roman"/>
           <w:sz w:val="19"/>
           <w:szCs w:val="19"/>
         </w:rPr>
-      </w:pPr>
+        <w:t xml:space="preserve">Richard </w:t>
+      </w:r>
       <w:r>
         <w:rPr>
           <w:rFonts w:ascii="Garamond" w:hAnsi="Garamond" w:cs="Times New Roman"/>
           <w:sz w:val="19"/>
           <w:szCs w:val="19"/>
         </w:rPr>
-        <w:t>Awards</w:t>
+        <w:t xml:space="preserve">Tomlinson </w:t>
       </w:r>
       <w:r>
         <w:rPr>
@@ -556,7 +543,7 @@
           <w:sz w:val="19"/>
           <w:szCs w:val="19"/>
         </w:rPr>
-        <w:t>: D. Lorne Gales Scholarship</w:t>
+        <w:t xml:space="preserve">Undergraduate </w:t>
       </w:r>
       <w:r>
         <w:rPr>
@@ -564,15 +551,7 @@
           <w:sz w:val="19"/>
           <w:szCs w:val="19"/>
         </w:rPr>
-        <w:t xml:space="preserve">, </w:t>
-      </w:r>
-      <w:r>
-        <w:rPr>
-          <w:rFonts w:ascii="Garamond" w:hAnsi="Garamond" w:cs="Times New Roman"/>
-          <w:sz w:val="19"/>
-          <w:szCs w:val="19"/>
-        </w:rPr>
-        <w:t>Tomlinson Engagement Award for Mentoring</w:t>
+        <w:t>Award</w:t>
       </w:r>
       <w:r>
         <w:rPr>
@@ -1141,15 +1120,15 @@
           <w:sz w:val="20"/>
           <w:szCs w:val="20"/>
         </w:rPr>
-        <w:t>. Alexey Kuznetsov with help from the Indiana Alcohol Research Center.</w:t>
-      </w:r>
-      <w:r>
-        <w:rPr>
-          <w:rFonts w:ascii="Garamond" w:hAnsi="Garamond" w:cs="Times New Roman"/>
-          <w:sz w:val="20"/>
-          <w:szCs w:val="20"/>
-        </w:rPr>
-        <w:t xml:space="preserve"> Funded by the NSF.</w:t>
+        <w:t>. Alexey Kuznetsov with help from the Indiana Alcohol Research Center</w:t>
+      </w:r>
+      <w:r>
+        <w:rPr>
+          <w:rFonts w:ascii="Garamond" w:hAnsi="Garamond" w:cs="Times New Roman"/>
+          <w:sz w:val="20"/>
+          <w:szCs w:val="20"/>
+        </w:rPr>
+        <w:t>.</w:t>
       </w:r>
     </w:p>
     <w:p>
@@ -1331,6 +1310,7 @@
     <w:p>
       <w:pPr>
         <w:spacing w:line="120" w:lineRule="auto"/>
+        <w:ind w:left="180"/>
         <w:rPr>
           <w:rFonts w:ascii="Garamond" w:hAnsi="Garamond" w:cs="Times New Roman"/>
           <w:b/>
@@ -1362,17 +1342,17 @@
           <w:sz w:val="20"/>
           <w:szCs w:val="20"/>
         </w:rPr>
-        <w:t xml:space="preserve">Undergraduate </w:t>
-      </w:r>
-      <w:r>
-        <w:rPr>
-          <w:rFonts w:ascii="Garamond" w:hAnsi="Garamond" w:cs="Times New Roman"/>
-          <w:b/>
-          <w:bCs/>
-          <w:sz w:val="20"/>
-          <w:szCs w:val="20"/>
-        </w:rPr>
-        <w:t>Thesis</w:t>
+        <w:t>GARCH and ARMA Risk Computation, Hosted by You</w:t>
+      </w:r>
+      <w:r>
+        <w:rPr>
+          <w:rFonts w:ascii="Garamond" w:hAnsi="Garamond" w:cs="Times New Roman"/>
+          <w:b/>
+          <w:bCs/>
+          <w:sz w:val="20"/>
+          <w:szCs w:val="20"/>
+        </w:rPr>
+        <w:t xml:space="preserve"> (GARCHY)</w:t>
       </w:r>
       <w:r>
         <w:rPr>
@@ -1390,7 +1370,7 @@
           <w:sz w:val="20"/>
           <w:szCs w:val="20"/>
         </w:rPr>
-        <w:t>2025</w:t>
+        <w:t>2026</w:t>
       </w:r>
     </w:p>
     <w:p>
@@ -1416,7 +1396,79 @@
           <w:sz w:val="20"/>
           <w:szCs w:val="20"/>
         </w:rPr>
-        <w:t>Researched</w:t>
+        <w:t xml:space="preserve">Developed an educational, </w:t>
+      </w:r>
+      <w:hyperlink r:id="rId13" w:history="1">
+        <w:r>
+          <w:rPr>
+            <w:rStyle w:val="Hyperlink"/>
+            <w:rFonts w:ascii="Garamond" w:hAnsi="Garamond" w:cs="Times New Roman"/>
+            <w:sz w:val="20"/>
+            <w:szCs w:val="20"/>
+          </w:rPr>
+          <w:t>web-ba</w:t>
+        </w:r>
+        <w:r>
+          <w:rPr>
+            <w:rStyle w:val="Hyperlink"/>
+            <w:rFonts w:ascii="Garamond" w:hAnsi="Garamond" w:cs="Times New Roman"/>
+            <w:sz w:val="20"/>
+            <w:szCs w:val="20"/>
+          </w:rPr>
+          <w:t>s</w:t>
+        </w:r>
+        <w:r>
+          <w:rPr>
+            <w:rStyle w:val="Hyperlink"/>
+            <w:rFonts w:ascii="Garamond" w:hAnsi="Garamond" w:cs="Times New Roman"/>
+            <w:sz w:val="20"/>
+            <w:szCs w:val="20"/>
+          </w:rPr>
+          <w:t>e</w:t>
+        </w:r>
+        <w:r>
+          <w:rPr>
+            <w:rStyle w:val="Hyperlink"/>
+            <w:rFonts w:ascii="Garamond" w:hAnsi="Garamond" w:cs="Times New Roman"/>
+            <w:sz w:val="20"/>
+            <w:szCs w:val="20"/>
+          </w:rPr>
+          <w:t>d</w:t>
+        </w:r>
+        <w:r>
+          <w:rPr>
+            <w:rStyle w:val="Hyperlink"/>
+            <w:rFonts w:ascii="Garamond" w:hAnsi="Garamond" w:cs="Times New Roman"/>
+            <w:sz w:val="20"/>
+            <w:szCs w:val="20"/>
+          </w:rPr>
+          <w:t xml:space="preserve"> applet</w:t>
+        </w:r>
+      </w:hyperlink>
+      <w:r>
+        <w:rPr>
+          <w:rStyle w:val="EndnoteReference"/>
+          <w:rFonts w:ascii="Garamond" w:hAnsi="Garamond" w:cs="Times New Roman"/>
+          <w:sz w:val="20"/>
+          <w:szCs w:val="20"/>
+        </w:rPr>
+        <w:endnoteReference w:id="5"/>
+      </w:r>
+      <w:r>
+        <w:rPr>
+          <w:rFonts w:ascii="Garamond" w:hAnsi="Garamond" w:cs="Times New Roman"/>
+          <w:sz w:val="20"/>
+          <w:szCs w:val="20"/>
+        </w:rPr>
+        <w:t xml:space="preserve"> that locally trains, evaluates, and </w:t>
+      </w:r>
+      <w:r>
+        <w:rPr>
+          <w:rFonts w:ascii="Garamond" w:hAnsi="Garamond" w:cs="Times New Roman"/>
+          <w:sz w:val="20"/>
+          <w:szCs w:val="20"/>
+        </w:rPr>
+        <w:t>simulates</w:t>
       </w:r>
       <w:r>
         <w:rPr>
@@ -1426,47 +1478,45 @@
         </w:rPr>
         <w:t xml:space="preserve"> </w:t>
       </w:r>
-      <w:proofErr w:type="spellStart"/>
-      <w:r>
-        <w:rPr>
-          <w:rFonts w:ascii="Garamond" w:hAnsi="Garamond" w:cs="Times New Roman"/>
-          <w:sz w:val="20"/>
-          <w:szCs w:val="20"/>
-        </w:rPr>
-        <w:t>supersingular</w:t>
-      </w:r>
-      <w:proofErr w:type="spellEnd"/>
-      <w:r>
-        <w:rPr>
-          <w:rFonts w:ascii="Garamond" w:hAnsi="Garamond" w:cs="Times New Roman"/>
-          <w:sz w:val="20"/>
-          <w:szCs w:val="20"/>
-        </w:rPr>
-        <w:t xml:space="preserve"> elliptic curve isogeny graphs</w:t>
-      </w:r>
-      <w:r>
-        <w:rPr>
-          <w:rFonts w:ascii="Garamond" w:hAnsi="Garamond" w:cs="Times New Roman"/>
-          <w:sz w:val="20"/>
-          <w:szCs w:val="20"/>
-        </w:rPr>
-        <w:t xml:space="preserve"> (SIGs)</w:t>
-      </w:r>
-      <w:r>
-        <w:rPr>
-          <w:rFonts w:ascii="Garamond" w:hAnsi="Garamond" w:cs="Times New Roman"/>
-          <w:sz w:val="20"/>
-          <w:szCs w:val="20"/>
-        </w:rPr>
-        <w:t xml:space="preserve"> over finite fields</w:t>
-      </w:r>
-      <w:r>
-        <w:rPr>
-          <w:rFonts w:ascii="Garamond" w:hAnsi="Garamond" w:cs="Times New Roman"/>
-          <w:sz w:val="20"/>
-          <w:szCs w:val="20"/>
-        </w:rPr>
-        <w:t xml:space="preserve"> and their applications to cryptography.</w:t>
+      <w:r>
+        <w:rPr>
+          <w:rFonts w:ascii="Garamond" w:hAnsi="Garamond" w:cs="Times New Roman"/>
+          <w:sz w:val="20"/>
+          <w:szCs w:val="20"/>
+        </w:rPr>
+        <w:t xml:space="preserve">user-specified ARMA-GARCH </w:t>
+      </w:r>
+      <w:r>
+        <w:rPr>
+          <w:rFonts w:ascii="Garamond" w:hAnsi="Garamond" w:cs="Times New Roman"/>
+          <w:sz w:val="20"/>
+          <w:szCs w:val="20"/>
+        </w:rPr>
+        <w:t>statistical models on custom stock portfolio</w:t>
+      </w:r>
+      <w:r>
+        <w:rPr>
+          <w:rFonts w:ascii="Garamond" w:hAnsi="Garamond" w:cs="Times New Roman"/>
+          <w:sz w:val="20"/>
+          <w:szCs w:val="20"/>
+        </w:rPr>
+        <w:t xml:space="preserve"> data. The models can be used to</w:t>
+      </w:r>
+      <w:r>
+        <w:rPr>
+          <w:rFonts w:ascii="Garamond" w:hAnsi="Garamond" w:cs="Times New Roman"/>
+          <w:sz w:val="20"/>
+          <w:szCs w:val="20"/>
+        </w:rPr>
+        <w:t xml:space="preserve"> forecast </w:t>
+      </w:r>
+      <w:r>
+        <w:rPr>
+          <w:rFonts w:ascii="Garamond" w:hAnsi="Garamond" w:cs="Times New Roman"/>
+          <w:sz w:val="20"/>
+          <w:szCs w:val="20"/>
+        </w:rPr>
+        <w:t>risk measures and volatility.</w:t>
       </w:r>
     </w:p>
     <w:p>
@@ -1492,6 +1542,171 @@
           <w:sz w:val="20"/>
           <w:szCs w:val="20"/>
         </w:rPr>
+        <w:t>Tooltips and interactive charts aim to educate the user on</w:t>
+      </w:r>
+      <w:r>
+        <w:rPr>
+          <w:rFonts w:ascii="Garamond" w:hAnsi="Garamond" w:cs="Times New Roman"/>
+          <w:sz w:val="20"/>
+          <w:szCs w:val="20"/>
+        </w:rPr>
+        <w:t xml:space="preserve"> model dynamics, performance, and risk estimation</w:t>
+      </w:r>
+      <w:r>
+        <w:rPr>
+          <w:rFonts w:ascii="Garamond" w:hAnsi="Garamond" w:cs="Times New Roman"/>
+          <w:sz w:val="20"/>
+          <w:szCs w:val="20"/>
+        </w:rPr>
+        <w:t xml:space="preserve">. </w:t>
+      </w:r>
+    </w:p>
+    <w:p>
+      <w:pPr>
+        <w:spacing w:line="120" w:lineRule="auto"/>
+        <w:rPr>
+          <w:rFonts w:ascii="Garamond" w:hAnsi="Garamond" w:cs="Times New Roman"/>
+          <w:b/>
+          <w:bCs/>
+          <w:sz w:val="20"/>
+          <w:szCs w:val="20"/>
+        </w:rPr>
+      </w:pPr>
+    </w:p>
+    <w:p>
+      <w:pPr>
+        <w:tabs>
+          <w:tab w:val="right" w:pos="10080"/>
+        </w:tabs>
+        <w:ind w:left="360"/>
+        <w:rPr>
+          <w:rFonts w:ascii="Garamond" w:hAnsi="Garamond" w:cs="Times New Roman"/>
+          <w:b/>
+          <w:bCs/>
+          <w:sz w:val="20"/>
+          <w:szCs w:val="20"/>
+        </w:rPr>
+      </w:pPr>
+      <w:r>
+        <w:rPr>
+          <w:rFonts w:ascii="Garamond" w:hAnsi="Garamond" w:cs="Times New Roman"/>
+          <w:b/>
+          <w:bCs/>
+          <w:sz w:val="20"/>
+          <w:szCs w:val="20"/>
+        </w:rPr>
+        <w:t xml:space="preserve">Undergraduate </w:t>
+      </w:r>
+      <w:r>
+        <w:rPr>
+          <w:rFonts w:ascii="Garamond" w:hAnsi="Garamond" w:cs="Times New Roman"/>
+          <w:b/>
+          <w:bCs/>
+          <w:sz w:val="20"/>
+          <w:szCs w:val="20"/>
+        </w:rPr>
+        <w:t>Thesis</w:t>
+      </w:r>
+      <w:r>
+        <w:rPr>
+          <w:rFonts w:ascii="Garamond" w:hAnsi="Garamond" w:cs="Times New Roman"/>
+          <w:b/>
+          <w:bCs/>
+          <w:sz w:val="20"/>
+          <w:szCs w:val="20"/>
+        </w:rPr>
+        <w:tab/>
+      </w:r>
+      <w:r>
+        <w:rPr>
+          <w:rFonts w:ascii="Garamond" w:hAnsi="Garamond" w:cs="Times New Roman"/>
+          <w:sz w:val="20"/>
+          <w:szCs w:val="20"/>
+        </w:rPr>
+        <w:t>2025</w:t>
+      </w:r>
+    </w:p>
+    <w:p>
+      <w:pPr>
+        <w:pStyle w:val="ListParagraph"/>
+        <w:numPr>
+          <w:ilvl w:val="0"/>
+          <w:numId w:val="1"/>
+        </w:numPr>
+        <w:tabs>
+          <w:tab w:val="right" w:pos="9360"/>
+        </w:tabs>
+        <w:ind w:hanging="180"/>
+        <w:rPr>
+          <w:rFonts w:ascii="Garamond" w:hAnsi="Garamond" w:cs="Times New Roman"/>
+          <w:sz w:val="20"/>
+          <w:szCs w:val="20"/>
+        </w:rPr>
+      </w:pPr>
+      <w:r>
+        <w:rPr>
+          <w:rFonts w:ascii="Garamond" w:hAnsi="Garamond" w:cs="Times New Roman"/>
+          <w:sz w:val="20"/>
+          <w:szCs w:val="20"/>
+        </w:rPr>
+        <w:t>Researched</w:t>
+      </w:r>
+      <w:r>
+        <w:rPr>
+          <w:rFonts w:ascii="Garamond" w:hAnsi="Garamond" w:cs="Times New Roman"/>
+          <w:sz w:val="20"/>
+          <w:szCs w:val="20"/>
+        </w:rPr>
+        <w:t xml:space="preserve"> supersingular elliptic curve isogeny graphs</w:t>
+      </w:r>
+      <w:r>
+        <w:rPr>
+          <w:rFonts w:ascii="Garamond" w:hAnsi="Garamond" w:cs="Times New Roman"/>
+          <w:sz w:val="20"/>
+          <w:szCs w:val="20"/>
+        </w:rPr>
+        <w:t xml:space="preserve"> (SIGs)</w:t>
+      </w:r>
+      <w:r>
+        <w:rPr>
+          <w:rFonts w:ascii="Garamond" w:hAnsi="Garamond" w:cs="Times New Roman"/>
+          <w:sz w:val="20"/>
+          <w:szCs w:val="20"/>
+        </w:rPr>
+        <w:t xml:space="preserve"> over finite fields</w:t>
+      </w:r>
+      <w:r>
+        <w:rPr>
+          <w:rFonts w:ascii="Garamond" w:hAnsi="Garamond" w:cs="Times New Roman"/>
+          <w:sz w:val="20"/>
+          <w:szCs w:val="20"/>
+        </w:rPr>
+        <w:t xml:space="preserve"> and their applications to cryptography.</w:t>
+      </w:r>
+    </w:p>
+    <w:p>
+      <w:pPr>
+        <w:pStyle w:val="ListParagraph"/>
+        <w:numPr>
+          <w:ilvl w:val="0"/>
+          <w:numId w:val="1"/>
+        </w:numPr>
+        <w:tabs>
+          <w:tab w:val="right" w:pos="9360"/>
+        </w:tabs>
+        <w:ind w:hanging="180"/>
+        <w:rPr>
+          <w:rFonts w:ascii="Garamond" w:hAnsi="Garamond" w:cs="Times New Roman"/>
+          <w:sz w:val="20"/>
+          <w:szCs w:val="20"/>
+        </w:rPr>
+      </w:pPr>
+      <w:r>
+        <w:rPr>
+          <w:rFonts w:ascii="Garamond" w:hAnsi="Garamond" w:cs="Times New Roman"/>
+          <w:sz w:val="20"/>
+          <w:szCs w:val="20"/>
+        </w:rPr>
         <w:t xml:space="preserve">Implemented </w:t>
       </w:r>
       <w:r>
@@ -1500,15 +1715,7 @@
           <w:sz w:val="20"/>
           <w:szCs w:val="20"/>
         </w:rPr>
-        <w:t xml:space="preserve">SIGs </w:t>
-      </w:r>
-      <w:r>
-        <w:rPr>
-          <w:rFonts w:ascii="Garamond" w:hAnsi="Garamond" w:cs="Times New Roman"/>
-          <w:sz w:val="20"/>
-          <w:szCs w:val="20"/>
-        </w:rPr>
-        <w:t xml:space="preserve">and their underlying algebraic structures </w:t>
+        <w:t xml:space="preserve">SIGs and their underlying algebraic structures </w:t>
       </w:r>
       <w:r>
         <w:rPr>
@@ -1558,17 +1765,27 @@
         </w:rPr>
         <w:t xml:space="preserve">Report </w:t>
       </w:r>
-      <w:hyperlink r:id="rId13" w:history="1">
-        <w:r>
-          <w:rPr>
-            <w:rStyle w:val="Hyperlink"/>
-            <w:rFonts w:ascii="Garamond" w:hAnsi="Garamond" w:cs="Times New Roman"/>
-            <w:sz w:val="20"/>
-            <w:szCs w:val="20"/>
-          </w:rPr>
-          <w:t>here</w:t>
-        </w:r>
-      </w:hyperlink>
+      <w:r>
+        <w:fldChar w:fldCharType="begin"/>
+      </w:r>
+      <w:r>
+        <w:instrText>HYPERLINK "https://nicholashayek.com/tex/MATH/470/470report.pdf"</w:instrText>
+      </w:r>
+      <w:r>
+        <w:fldChar w:fldCharType="separate"/>
+      </w:r>
+      <w:r>
+        <w:rPr>
+          <w:rStyle w:val="Hyperlink"/>
+          <w:rFonts w:ascii="Garamond" w:hAnsi="Garamond" w:cs="Times New Roman"/>
+          <w:sz w:val="20"/>
+          <w:szCs w:val="20"/>
+        </w:rPr>
+        <w:t>here</w:t>
+      </w:r>
+      <w:r>
+        <w:fldChar w:fldCharType="end"/>
+      </w:r>
       <w:r>
         <w:rPr>
           <w:rStyle w:val="EndnoteReference"/>
@@ -1576,7 +1793,7 @@
           <w:sz w:val="20"/>
           <w:szCs w:val="20"/>
         </w:rPr>
-        <w:endnoteReference w:id="5"/>
+        <w:endnoteReference w:id="6"/>
       </w:r>
       <w:r>
         <w:rPr>
@@ -1703,7 +1920,7 @@
           <w:sz w:val="20"/>
           <w:szCs w:val="20"/>
         </w:rPr>
-        <w:endnoteReference w:id="6"/>
+        <w:endnoteReference w:id="7"/>
       </w:r>
       <w:r>
         <w:rPr>
@@ -1735,23 +1952,7 @@
           <w:sz w:val="20"/>
           <w:szCs w:val="20"/>
         </w:rPr>
-        <w:t xml:space="preserve">, with integer equation parsing and execution, in </w:t>
-      </w:r>
-      <w:r>
-        <w:rPr>
-          <w:rFonts w:ascii="Garamond" w:hAnsi="Garamond" w:cs="Times New Roman"/>
-          <w:sz w:val="20"/>
-          <w:szCs w:val="20"/>
-        </w:rPr>
-        <w:t>JavaScript</w:t>
-      </w:r>
-      <w:r>
-        <w:rPr>
-          <w:rFonts w:ascii="Garamond" w:hAnsi="Garamond" w:cs="Times New Roman"/>
-          <w:sz w:val="20"/>
-          <w:szCs w:val="20"/>
-        </w:rPr>
-        <w:t xml:space="preserve">. </w:t>
+        <w:t xml:space="preserve">, with integer equation parsing and execution. </w:t>
       </w:r>
     </w:p>
     <w:p>
@@ -2321,7 +2522,7 @@
           <w:sz w:val="20"/>
           <w:szCs w:val="20"/>
         </w:rPr>
-        <w:endnoteReference w:id="7"/>
+        <w:endnoteReference w:id="8"/>
       </w:r>
       <w:r>
         <w:rPr>
@@ -2442,31 +2643,7 @@
           <w:sz w:val="20"/>
           <w:szCs w:val="20"/>
         </w:rPr>
-        <w:t>C++</w:t>
-      </w:r>
-      <w:r>
-        <w:rPr>
-          <w:rFonts w:ascii="Garamond" w:hAnsi="Garamond" w:cs="Times New Roman"/>
-          <w:sz w:val="20"/>
-          <w:szCs w:val="20"/>
-        </w:rPr>
-        <w:t xml:space="preserve">, C, </w:t>
-      </w:r>
-      <w:r>
-        <w:rPr>
-          <w:rFonts w:ascii="Garamond" w:hAnsi="Garamond" w:cs="Times New Roman"/>
-          <w:sz w:val="20"/>
-          <w:szCs w:val="20"/>
-        </w:rPr>
-        <w:t>Java</w:t>
-      </w:r>
-      <w:r>
-        <w:rPr>
-          <w:rFonts w:ascii="Garamond" w:hAnsi="Garamond" w:cs="Times New Roman"/>
-          <w:sz w:val="20"/>
-          <w:szCs w:val="20"/>
-        </w:rPr>
-        <w:t xml:space="preserve">, </w:t>
+        <w:t xml:space="preserve">C++, C, Java, </w:t>
       </w:r>
       <w:r>
         <w:rPr>
@@ -2681,7 +2858,23 @@
           <w:sz w:val="20"/>
           <w:szCs w:val="20"/>
         </w:rPr>
-        <w:t xml:space="preserve">Student Researcher at the </w:t>
+        <w:t>V</w:t>
+      </w:r>
+      <w:r>
+        <w:rPr>
+          <w:rFonts w:ascii="Garamond" w:hAnsi="Garamond" w:cs="Times New Roman"/>
+          <w:sz w:val="20"/>
+          <w:szCs w:val="20"/>
+        </w:rPr>
+        <w:t xml:space="preserve">ice President, External </w:t>
+      </w:r>
+      <w:r>
+        <w:rPr>
+          <w:rFonts w:ascii="Garamond" w:hAnsi="Garamond" w:cs="Times New Roman"/>
+          <w:sz w:val="20"/>
+          <w:szCs w:val="20"/>
+        </w:rPr>
+        <w:t xml:space="preserve">at the </w:t>
       </w:r>
       <w:r>
         <w:rPr>
@@ -2690,15 +2883,31 @@
           <w:szCs w:val="20"/>
           <w:u w:val="single"/>
         </w:rPr>
-        <w:t>McGill AI Lab</w:t>
-      </w:r>
-      <w:r>
-        <w:rPr>
-          <w:rFonts w:ascii="Garamond" w:hAnsi="Garamond" w:cs="Times New Roman"/>
-          <w:sz w:val="20"/>
-          <w:szCs w:val="20"/>
-        </w:rPr>
-        <w:t xml:space="preserve"> (2025)</w:t>
+        <w:t>Society of Undergraduate Mathematics Students</w:t>
+      </w:r>
+      <w:r>
+        <w:rPr>
+          <w:rFonts w:ascii="Garamond" w:hAnsi="Garamond" w:cs="Times New Roman"/>
+          <w:sz w:val="20"/>
+          <w:szCs w:val="20"/>
+        </w:rPr>
+        <w:t xml:space="preserve"> (2024</w:t>
+      </w:r>
+      <w:r>
+        <w:rPr>
+          <w:rFonts w:ascii="Garamond" w:hAnsi="Garamond" w:cs="Times New Roman"/>
+          <w:sz w:val="20"/>
+          <w:szCs w:val="20"/>
+        </w:rPr>
+        <w:t>-2026</w:t>
+      </w:r>
+      <w:r>
+        <w:rPr>
+          <w:rFonts w:ascii="Garamond" w:hAnsi="Garamond" w:cs="Times New Roman"/>
+          <w:sz w:val="20"/>
+          <w:szCs w:val="20"/>
+        </w:rPr>
+        <w:t>)</w:t>
       </w:r>
     </w:p>
     <w:p>
@@ -2716,8 +2925,6 @@
       <w:r>
         <w:rPr>
           <w:rFonts w:ascii="Garamond" w:hAnsi="Garamond" w:cs="Times New Roman"/>
-          <w:b/>
-          <w:bCs/>
           <w:sz w:val="20"/>
           <w:szCs w:val="20"/>
         </w:rPr>
@@ -2729,7 +2936,7 @@
           <w:sz w:val="20"/>
           <w:szCs w:val="20"/>
         </w:rPr>
-        <w:t xml:space="preserve">Vice President at the </w:t>
+        <w:t xml:space="preserve">Student Researcher at the </w:t>
       </w:r>
       <w:r>
         <w:rPr>
@@ -2738,15 +2945,15 @@
           <w:szCs w:val="20"/>
           <w:u w:val="single"/>
         </w:rPr>
-        <w:t>Society of Undergraduate Mathematics Students</w:t>
-      </w:r>
-      <w:r>
-        <w:rPr>
-          <w:rFonts w:ascii="Garamond" w:hAnsi="Garamond" w:cs="Times New Roman"/>
-          <w:sz w:val="20"/>
-          <w:szCs w:val="20"/>
-        </w:rPr>
-        <w:t xml:space="preserve"> (2024-26)</w:t>
+        <w:t>McGill AI Lab</w:t>
+      </w:r>
+      <w:r>
+        <w:rPr>
+          <w:rFonts w:ascii="Garamond" w:hAnsi="Garamond" w:cs="Times New Roman"/>
+          <w:sz w:val="20"/>
+          <w:szCs w:val="20"/>
+        </w:rPr>
+        <w:t xml:space="preserve"> (2025)</w:t>
       </w:r>
     </w:p>
     <w:p>
@@ -2825,24 +3032,21 @@
         <w:tabs>
           <w:tab w:val="left" w:leader="dot" w:pos="2880"/>
         </w:tabs>
-        <w:ind w:left="2880" w:hanging="2880"/>
-        <w:rPr>
-          <w:rFonts w:ascii="Garamond" w:hAnsi="Garamond" w:cs="Times New Roman"/>
-          <w:b/>
-          <w:bCs/>
-          <w:sz w:val="20"/>
-          <w:szCs w:val="20"/>
-        </w:rPr>
-      </w:pPr>
-      <w:r>
-        <w:rPr>
-          <w:rFonts w:ascii="Garamond" w:hAnsi="Garamond" w:cs="Times New Roman"/>
-          <w:b/>
-          <w:bCs/>
-          <w:sz w:val="20"/>
-          <w:szCs w:val="20"/>
-        </w:rPr>
-        <w:t>GRE</w:t>
+        <w:rPr>
+          <w:rFonts w:ascii="Garamond" w:hAnsi="Garamond" w:cs="Times New Roman"/>
+          <w:sz w:val="20"/>
+          <w:szCs w:val="20"/>
+        </w:rPr>
+      </w:pPr>
+      <w:r>
+        <w:rPr>
+          <w:rFonts w:ascii="Garamond" w:hAnsi="Garamond" w:cs="Times New Roman"/>
+          <w:b/>
+          <w:bCs/>
+          <w:sz w:val="20"/>
+          <w:szCs w:val="20"/>
+        </w:rPr>
+        <w:t>Languages</w:t>
       </w:r>
       <w:r>
         <w:rPr>
@@ -2851,47 +3055,7 @@
           <w:szCs w:val="20"/>
         </w:rPr>
         <w:tab/>
-        <w:t>170</w:t>
-      </w:r>
-      <w:r>
-        <w:rPr>
-          <w:rFonts w:ascii="Garamond" w:hAnsi="Garamond" w:cs="Times New Roman"/>
-          <w:sz w:val="20"/>
-          <w:szCs w:val="20"/>
-        </w:rPr>
-        <w:t xml:space="preserve"> </w:t>
-      </w:r>
-      <w:r>
-        <w:rPr>
-          <w:rFonts w:ascii="Garamond" w:hAnsi="Garamond" w:cs="Times New Roman"/>
-          <w:sz w:val="20"/>
-          <w:szCs w:val="20"/>
-        </w:rPr>
-        <w:t>Quant</w:t>
-      </w:r>
-      <w:r>
-        <w:rPr>
-          <w:rFonts w:ascii="Garamond" w:hAnsi="Garamond" w:cs="Times New Roman"/>
-          <w:sz w:val="20"/>
-          <w:szCs w:val="20"/>
-        </w:rPr>
-        <w:t xml:space="preserve">itative, 165 </w:t>
-      </w:r>
-      <w:r>
-        <w:rPr>
-          <w:rFonts w:ascii="Garamond" w:hAnsi="Garamond" w:cs="Times New Roman"/>
-          <w:sz w:val="20"/>
-          <w:szCs w:val="20"/>
-        </w:rPr>
-        <w:t>Verbal</w:t>
-      </w:r>
-      <w:r>
-        <w:rPr>
-          <w:rFonts w:ascii="Garamond" w:hAnsi="Garamond" w:cs="Times New Roman"/>
-          <w:sz w:val="20"/>
-          <w:szCs w:val="20"/>
-        </w:rPr>
-        <w:t xml:space="preserve"> (2025)</w:t>
+        <w:t>English (native)</w:t>
       </w:r>
     </w:p>
     <w:p>
@@ -2913,37 +3077,6 @@
           <w:sz w:val="20"/>
           <w:szCs w:val="20"/>
         </w:rPr>
-        <w:t>Languages</w:t>
-      </w:r>
-      <w:r>
-        <w:rPr>
-          <w:rFonts w:ascii="Garamond" w:hAnsi="Garamond" w:cs="Times New Roman"/>
-          <w:sz w:val="20"/>
-          <w:szCs w:val="20"/>
-        </w:rPr>
-        <w:tab/>
-        <w:t>English (native)</w:t>
-      </w:r>
-    </w:p>
-    <w:p>
-      <w:pPr>
-        <w:tabs>
-          <w:tab w:val="left" w:leader="dot" w:pos="2880"/>
-        </w:tabs>
-        <w:rPr>
-          <w:rFonts w:ascii="Garamond" w:hAnsi="Garamond" w:cs="Times New Roman"/>
-          <w:sz w:val="20"/>
-          <w:szCs w:val="20"/>
-        </w:rPr>
-      </w:pPr>
-      <w:r>
-        <w:rPr>
-          <w:rFonts w:ascii="Garamond" w:hAnsi="Garamond" w:cs="Times New Roman"/>
-          <w:b/>
-          <w:bCs/>
-          <w:sz w:val="20"/>
-          <w:szCs w:val="20"/>
-        </w:rPr>
         <w:t>Interests</w:t>
       </w:r>
       <w:r>
@@ -2979,20 +3112,6 @@
         </w:rPr>
         <w:t xml:space="preserve"> reading</w:t>
       </w:r>
-    </w:p>
-    <w:p>
-      <w:pPr>
-        <w:tabs>
-          <w:tab w:val="left" w:pos="2880"/>
-        </w:tabs>
-        <w:rPr>
-          <w:rFonts w:ascii="Garamond" w:hAnsi="Garamond" w:cs="Times New Roman"/>
-          <w:b/>
-          <w:bCs/>
-          <w:sz w:val="19"/>
-          <w:szCs w:val="19"/>
-        </w:rPr>
-      </w:pPr>
     </w:p>
     <w:p>
       <w:pPr>
@@ -3173,15 +3292,7 @@
           <w:sz w:val="19"/>
           <w:szCs w:val="19"/>
         </w:rPr>
-        <w:t xml:space="preserve"> </w:t>
-      </w:r>
-      <w:r>
-        <w:rPr>
-          <w:rFonts w:ascii="Garamond" w:hAnsi="Garamond"/>
-          <w:sz w:val="19"/>
-          <w:szCs w:val="19"/>
-        </w:rPr>
-        <w:t>https://www.linkedin.com/in/nicholas-hayek-b24b1a243/</w:t>
+        <w:t xml:space="preserve"> https://www.linkedin.com/in/nicholas-hayek-b24b1a243/</w:t>
       </w:r>
     </w:p>
   </w:endnote>
@@ -3223,6 +3334,7 @@
           <w:rFonts w:ascii="Garamond" w:hAnsi="Garamond"/>
           <w:sz w:val="19"/>
           <w:szCs w:val="19"/>
+          <w:lang w:val="en-US"/>
         </w:rPr>
       </w:pPr>
       <w:r>
@@ -3240,11 +3352,48 @@
           <w:sz w:val="19"/>
           <w:szCs w:val="19"/>
         </w:rPr>
-        <w:t xml:space="preserve"> https://nicholashayek.com/tex/MATH/470/470report.pdf</w:t>
+        <w:t xml:space="preserve"> </w:t>
+      </w:r>
+      <w:r>
+        <w:rPr>
+          <w:rFonts w:ascii="Garamond" w:hAnsi="Garamond"/>
+          <w:sz w:val="19"/>
+          <w:szCs w:val="19"/>
+        </w:rPr>
+        <w:t>https://garchy.nicholashayek.com/</w:t>
       </w:r>
     </w:p>
   </w:endnote>
   <w:endnote w:id="6">
+    <w:p>
+      <w:pPr>
+        <w:pStyle w:val="EndnoteText"/>
+        <w:rPr>
+          <w:rFonts w:ascii="Garamond" w:hAnsi="Garamond"/>
+          <w:sz w:val="19"/>
+          <w:szCs w:val="19"/>
+        </w:rPr>
+      </w:pPr>
+      <w:r>
+        <w:rPr>
+          <w:rStyle w:val="EndnoteReference"/>
+          <w:rFonts w:ascii="Garamond" w:hAnsi="Garamond"/>
+          <w:sz w:val="19"/>
+          <w:szCs w:val="19"/>
+        </w:rPr>
+        <w:endnoteRef/>
+      </w:r>
+      <w:r>
+        <w:rPr>
+          <w:rFonts w:ascii="Garamond" w:hAnsi="Garamond"/>
+          <w:sz w:val="19"/>
+          <w:szCs w:val="19"/>
+        </w:rPr>
+        <w:t xml:space="preserve"> https://nicholashayek.com/tex/MATH/470/470report.pdf</w:t>
+      </w:r>
+    </w:p>
+  </w:endnote>
+  <w:endnote w:id="7">
     <w:p>
       <w:pPr>
         <w:pStyle w:val="EndnoteText"/>
@@ -3270,19 +3419,11 @@
           <w:sz w:val="19"/>
           <w:szCs w:val="19"/>
         </w:rPr>
-        <w:t xml:space="preserve"> </w:t>
-      </w:r>
-      <w:r>
-        <w:rPr>
-          <w:rFonts w:ascii="Garamond" w:hAnsi="Garamond"/>
-          <w:sz w:val="19"/>
-          <w:szCs w:val="19"/>
-        </w:rPr>
-        <w:t>https://yayacs.nicholashayek.com/</w:t>
+        <w:t xml:space="preserve"> https://yayacs.nicholashayek.com/</w:t>
       </w:r>
     </w:p>
   </w:endnote>
-  <w:endnote w:id="7">
+  <w:endnote w:id="8">
     <w:p>
       <w:pPr>
         <w:pStyle w:val="EndnoteText"/>

</xml_diff>